<commit_message>
docs: rewrite report for MIT-inspired theme, shikha@iubat.edu staff, Neon ep-snowy-cherry and shikha42 repo
</commit_message>
<xml_diff>
--- a/IUBAT_Student_Service_Request_System_Report.docx
+++ b/IUBAT_Student_Service_Request_System_Report.docx
@@ -1,5 +1,70 @@
 
-<file path=word/document.xml><?xml version="1.0" encoding="utf-8"?>
+<file path=customXml\item1.xml><?xml version="1.0" encoding="utf-8"?>
+<b:Sources xmlns:b="http://schemas.openxmlformats.org/officeDocument/2006/bibliography" xmlns="http://schemas.openxmlformats.org/officeDocument/2006/bibliography" SelectedStyle="/APA.XSL" StyleName="APA"/>
+</file>
+
+<file path=customXml\itemProps1.xml><?xml version="1.0" encoding="utf-8"?>
+<ds:datastoreItem xmlns:ds="http://schemas.openxmlformats.org/officeDocument/2006/customXml" ds:itemID="{EF278816-EC6F-A645-907D-7F25AECB1D4A}">
+  <ds:schemaRefs>
+    <ds:schemaRef ds:uri="http://schemas.openxmlformats.org/officeDocument/2006/bibliography"/>
+  </ds:schemaRefs>
+</ds:datastoreItem>
+</file>
+
+<file path=docProps\app.xml><?xml version="1.0" encoding="utf-8"?>
+<Properties xmlns="http://schemas.openxmlformats.org/officeDocument/2006/extended-properties" xmlns:vt="http://schemas.openxmlformats.org/officeDocument/2006/docPropsVTypes">
+  <Template>Normal</Template>
+  <TotalTime>365</TotalTime>
+  <Pages>18</Pages>
+  <Words>3702</Words>
+  <Characters>21104</Characters>
+  <Application>Microsoft Office Word</Application>
+  <DocSecurity>0</DocSecurity>
+  <Lines>175</Lines>
+  <Paragraphs>49</Paragraphs>
+  <ScaleCrop>false</ScaleCrop>
+  <HeadingPairs>
+    <vt:vector size="2" baseType="variant">
+      <vt:variant>
+        <vt:lpstr>Title</vt:lpstr>
+      </vt:variant>
+      <vt:variant>
+        <vt:i4>1</vt:i4>
+      </vt:variant>
+    </vt:vector>
+  </HeadingPairs>
+  <TitlesOfParts>
+    <vt:vector size="1" baseType="lpstr">
+      <vt:lpstr>IUBAT Student Service Request System — Assignment Report (WebApplication2)</vt:lpstr>
+    </vt:vector>
+  </TitlesOfParts>
+  <Manager/>
+  <Company/>
+  <LinksUpToDate>false</LinksUpToDate>
+  <CharactersWithSpaces>24757</CharactersWithSpaces>
+  <SharedDoc>false</SharedDoc>
+  <HyperlinkBase/>
+  <HyperlinksChanged>false</HyperlinksChanged>
+  <AppVersion>16.0000</AppVersion>
+</Properties>
+</file>
+
+<file path=docProps\core.xml><?xml version="1.0" encoding="utf-8"?>
+<cp:coreProperties xmlns:cp="http://schemas.openxmlformats.org/package/2006/metadata/core-properties" xmlns:dc="http://purl.org/dc/elements/1.1/" xmlns:dcterms="http://purl.org/dc/terms/" xmlns:dcmitype="http://purl.org/dc/dcmitype/" xmlns:xsi="http://www.w3.org/2001/XMLSchema-instance">
+  <dc:title>IUBAT Student Service Request System — Assignment Report (WebApplication1 — MIT-inspired)</dc:title>
+  <dc:subject>ASP.NET MVC + Neon + Render</dc:subject>
+  <dc:creator>Shikha — IUBAT</dc:creator>
+  <cp:keywords>ASP.NET MVC, EF Core, Npgsql, Neon, Render, IUBAT, Student Service</cp:keywords>
+  <dc:description>WebApplication1 (MIT-inspired) — shikha42/Shikha-Student-service b47cec9</dc:description>
+  <cp:lastModifiedBy>shikha42</cp:lastModifiedBy>
+  <cp:revision>18</cp:revision>
+  <dcterms:created xsi:type="dcterms:W3CDTF">2026-09-03T12:42:00Z</dcterms:created>
+  <dcterms:modified xsi:type="dcterms:W3CDTF">2026-09-04T08:02:00Z</dcterms:modified>
+  <cp:category/>
+</cp:coreProperties>
+</file>
+
+<file path=word\document.xml><?xml version="1.0" encoding="utf-8"?>
 <w:document xmlns:wpc="http://schemas.microsoft.com/office/word/2010/wordprocessingCanvas" xmlns:cx="http://schemas.microsoft.com/office/drawing/2014/chartex" xmlns:cx1="http://schemas.microsoft.com/office/drawing/2015/9/8/chartex" xmlns:cx2="http://schemas.microsoft.com/office/drawing/2015/10/21/chartex" xmlns:cx3="http://schemas.microsoft.com/office/drawing/2016/5/9/chartex" xmlns:cx4="http://schemas.microsoft.com/office/drawing/2016/5/10/chartex" xmlns:cx5="http://schemas.microsoft.com/office/drawing/2016/5/11/chartex" xmlns:cx6="http://schemas.microsoft.com/office/drawing/2016/5/12/chartex" xmlns:cx7="http://schemas.microsoft.com/office/drawing/2016/5/13/chartex" xmlns:cx8="http://schemas.microsoft.com/office/drawing/2016/5/14/chartex" xmlns:mc="http://schemas.openxmlformats.org/markup-compatibility/2006" xmlns:aink="http://schemas.microsoft.com/office/drawing/2016/ink" xmlns:am3d="http://schemas.microsoft.com/office/drawing/2017/model3d" xmlns:o="urn:schemas-microsoft-com:office:office" xmlns:r="http://schemas.openxmlformats.org/officeDocument/2006/relationships" xmlns:m="http://schemas.openxmlformats.org/officeDocument/2006/math" xmlns:v="urn:schemas-microsoft-com:vml" xmlns:wp14="http://schemas.microsoft.com/office/word/2010/wordprocessingDrawing" xmlns:wp="http://schemas.openxmlformats.org/drawingml/2006/wordprocessingDrawing" xmlns:w10="urn:schemas-microsoft-com:office:word" xmlns:w="http://schemas.openxmlformats.org/wordprocessingml/2006/main" xmlns:w14="http://schemas.microsoft.com/office/word/2010/wordml" xmlns:w15="http://schemas.microsoft.com/office/word/2012/wordml" xmlns:w16cex="http://schemas.microsoft.com/office/word/2018/wordml/cex" xmlns:w16cid="http://schemas.microsoft.com/office/word/2016/wordml/cid" xmlns:w16="http://schemas.microsoft.com/office/word/2018/wordml" xmlns:w16sdtdh="http://schemas.microsoft.com/office/word/2020/wordml/sdtdatahash" xmlns:w16se="http://schemas.microsoft.com/office/word/2015/wordml/symex" xmlns:wpg="http://schemas.microsoft.com/office/word/2010/wordprocessingGroup" xmlns:wpi="http://schemas.microsoft.com/office/word/2010/wordprocessingInk" xmlns:wne="http://schemas.microsoft.com/office/word/2006/wordml" xmlns:wps="http://schemas.microsoft.com/office/word/2010/wordprocessingShape" mc:Ignorable="w14 w15 w16se w16cid w16 w16cex w16sdtdh wp14">
   <w:body>
     <w:p>
@@ -86,7 +151,7 @@
         <w:jc w:val="center"/>
       </w:pPr>
       <w:r>
-        <w:t xml:space="preserve">Course: Visual Programing </w:t>
+        <w:t xml:space="preserve">Course: Visual Programming </w:t>
       </w:r>
       <w:r>
         <w:br/>
@@ -190,7 +255,7 @@
           <w:sz w:val="24"/>
           <w:szCs w:val="28"/>
         </w:rPr>
-        <w:t>Aranna</w:t>
+        <w:t>Shikha</w:t>
       </w:r>
       <w:proofErr w:type="spellEnd"/>
       <w:r>
@@ -267,7 +332,7 @@
             <w:sz w:val="22"/>
             <w:szCs w:val="36"/>
           </w:rPr>
-          <w:t>https://github.com/aranna08-dev/sevice-of-student</w:t>
+          <w:t>https://github.com/shikha42/Shikha-Student-service</w:t>
         </w:r>
       </w:hyperlink>
     </w:p>
@@ -289,7 +354,7 @@
           <w:rPr>
             <w:rStyle w:val="Hyperlink"/>
           </w:rPr>
-          <w:t>https://sevice-of-student.onrender.com/</w:t>
+          <w:t>https://shikha-student-service.onrender.com/</w:t>
         </w:r>
       </w:hyperlink>
     </w:p>
@@ -320,7 +385,7 @@
             <w:sz w:val="22"/>
             <w:szCs w:val="36"/>
           </w:rPr>
-          <w:t>https://console.neon.tech/app/projects/noisy-mouse-46909919/branches/br-rapid-math-a5r24u7q/tables?database=neond</w:t>
+          <w:t>https://console.neon.tech/app/projects/ep-snowy-cherry-axbwx1z8/branches/ep-snowy-cherry-axbwx1z8/tables?database=neond</w:t>
         </w:r>
         <w:r>
           <w:rPr>
@@ -1938,7 +2003,7 @@
           <w:sz w:val="24"/>
           <w:szCs w:val="24"/>
         </w:rPr>
-        <w:t>The objectives for WebApplication2 (Emerald Academic) are:</w:t>
+        <w:t>The objectives for WebApplication1 (MIT-inspired) are:</w:t>
       </w:r>
     </w:p>
     <w:p>
@@ -2685,7 +2750,7 @@
                 <w:sz w:val="24"/>
                 <w:szCs w:val="24"/>
               </w:rPr>
-              <w:t>Owner / Evidence in WebApplication2</w:t>
+              <w:t>Owner / Evidence in WebApplication1</w:t>
             </w:r>
           </w:p>
         </w:tc>
@@ -3154,7 +3219,7 @@
                 <w:sz w:val="24"/>
                 <w:szCs w:val="24"/>
               </w:rPr>
-              <w:t xml:space="preserve"> shakkhorpaul50@gmail.com</w:t>
+              <w:t xml:space="preserve"> shikha@iubat.edu</w:t>
             </w:r>
           </w:p>
         </w:tc>
@@ -4437,7 +4502,7 @@
           <w:sz w:val="24"/>
           <w:szCs w:val="24"/>
         </w:rPr>
-        <w:t xml:space="preserve">WebApplication2 resolves the conflict by </w:t>
+        <w:t xml:space="preserve">WebApplication1 resolves the conflict by </w:t>
       </w:r>
       <w:r>
         <w:rPr>
@@ -4669,7 +4734,7 @@
           <w:sz w:val="24"/>
           <w:szCs w:val="24"/>
         </w:rPr>
-        <w:t>) creates Student/Staff roles and a single staff account (shakkhorpaul50@gmail.com) — university retains control, no public staff self-registration.</w:t>
+        <w:t>) creates Student/Staff roles and a single staff account (shikha@iubat.edu) — university retains control, no public staff self-registration.</w:t>
       </w:r>
     </w:p>
     <w:p>
@@ -4745,7 +4810,7 @@
           <w:sz w:val="24"/>
           <w:szCs w:val="24"/>
         </w:rPr>
-        <w:t xml:space="preserve">WebApplication2 is a server-rendered ASP.NET MVC 10 application (C#) that centralizes the request lifecycle into a single aggregate: </w:t>
+        <w:t xml:space="preserve">WebApplication1 is a server-rendered ASP.NET MVC 10 application (C#) that centralizes the request lifecycle into a single aggregate: </w:t>
       </w:r>
       <w:r>
         <w:rPr>
@@ -4836,7 +4901,7 @@
           <w:sz w:val="24"/>
           <w:szCs w:val="24"/>
         </w:rPr>
-        <w:t xml:space="preserve">; authentication is delegated to ASP.NET Identity with role claims (Student, Staff). The app is stateless, containerized (Docker), and connects to a pooled Neon PostgreSQL instance (ep-sweet-night-...) via EF Core + </w:t>
+        <w:t xml:space="preserve">; authentication is delegated to ASP.NET Identity with role claims (Student, Staff). The app is stateless, containerized (Docker), and connects to a pooled Neon PostgreSQL instance (ep-snowy-cherry-...) via EF Core + </w:t>
       </w:r>
       <w:proofErr w:type="spellStart"/>
       <w:r>
@@ -5021,7 +5086,7 @@
           <w:sz w:val="24"/>
           <w:szCs w:val="24"/>
         </w:rPr>
-        <w:t>Theme distinction: Emerald Academic (teal #0F766E + amber accent) vs. WebApplication1's indigo — same logic, visibly distinct UI to satisfy the individual-submission requirement while proving CSS/Bootstrap mastery.</w:t>
+        <w:t>Theme distinction: MIT-inspired (cardinal #A31F34 + gray accent) vs. WebApplication1's black — same logic, visibly distinct UI to satisfy the individual-submission requirement while proving CSS/Bootstrap mastery.</w:t>
       </w:r>
     </w:p>
     <w:p>
@@ -7142,7 +7207,7 @@
           <w:sz w:val="24"/>
           <w:szCs w:val="24"/>
         </w:rPr>
-        <w:t>Emerald light navbar (🌿 Campus Services), role-aware links, footer; site.css Emerald Academic</w:t>
+        <w:t>MIT light navbar (🌿 Campus Services), role-aware links, footer; site.css MIT-inspired</w:t>
       </w:r>
     </w:p>
     <w:p>
@@ -7159,7 +7224,7 @@
           <w:sz w:val="24"/>
           <w:szCs w:val="24"/>
         </w:rPr>
-        <w:t>Home/Index: hero (split light + left 6px teal bar) + 3 feature cards (🗂️ Request Online, 🔍 Live Tracking, 🛡️ Staff-Only Control) + status bar.</w:t>
+        <w:t>Home/Index: hero (split light + left 6px cardinal bar) + 3 feature cards (🗂️ Request Online, 🔍 Live Tracking, 🛡️ Staff-Only Control) + status bar.</w:t>
       </w:r>
     </w:p>
     <w:p>
@@ -7176,7 +7241,7 @@
           <w:sz w:val="24"/>
           <w:szCs w:val="24"/>
         </w:rPr>
-        <w:t xml:space="preserve">Account/Login &amp; Register: auth-card (white + top teal stripe), </w:t>
+        <w:t xml:space="preserve">Account/Login &amp; Register: auth-card (white + top cardinal stripe), </w:t>
       </w:r>
       <w:proofErr w:type="spellStart"/>
       <w:r>
@@ -8036,7 +8101,7 @@
           <w:sz w:val="24"/>
           <w:szCs w:val="24"/>
         </w:rPr>
-        <w:t xml:space="preserve"> abstracts Neon. The diagram also explains why WebApplication2 can change theme (View/CSS) without touching Controller/Model — a key MVC advantage.</w:t>
+        <w:t xml:space="preserve"> abstracts Neon. The diagram also explains why WebApplication1 can change theme (View/CSS) without touching Controller/Model — a key MVC advantage.</w:t>
       </w:r>
     </w:p>
     <w:p>
@@ -8068,7 +8133,7 @@
           <w:sz w:val="24"/>
           <w:szCs w:val="24"/>
         </w:rPr>
-        <w:t>The database is code-first EF Core on Neon pooled Postgres (ep-sweet-night-ay088hki-pooler.c-5...). One domain table plus the standard ASP.NET Identity schema (auto-created).</w:t>
+        <w:t>The database is code-first EF Core on Neon pooled Postgres (ep-snowy-cherry-axbwx1z8-pooler.c-4.us-east-2.aws.neon.tech...). One domain table plus the standard ASP.NET Identity schema (auto-created).</w:t>
       </w:r>
     </w:p>
     <w:tbl>
@@ -9657,7 +9722,7 @@
           <w:sz w:val="24"/>
           <w:szCs w:val="24"/>
         </w:rPr>
-        <w:t>WebApplication2 was implemented in .NET 10.0 as an ASP.NET MVC project (WebApplication1.csproj) and verified locally (dotnet build 0 warnings) and via Docker on Render. The theme is Emerald Academic — a light, teal/amber design distinct from WebApplication1's indigo/dark — proving that View/CSS can be swapped without altering Controller/Model logic.</w:t>
+        <w:t>WebApplication1 was implemented in .NET 10.0 as an ASP.NET MVC project (WebApplication1.csproj) and verified locally (dotnet build 0 warnings) and via Docker on Render. The theme is MIT-inspired — a light, cardinal/black MIT design distinct from WebApplication1's black/red — proving that View/CSS can be swapped without altering Controller/Model logic.</w:t>
       </w:r>
     </w:p>
     <w:p>
@@ -10254,7 +10319,7 @@
           <w:sz w:val="24"/>
           <w:szCs w:val="24"/>
         </w:rPr>
-        <w:t xml:space="preserve"> (WebApplication2: c8e0aa1) adds: </w:t>
+        <w:t xml:space="preserve"> (WebApplication1: b47cec9) adds: </w:t>
       </w:r>
     </w:p>
     <w:p>
@@ -10522,7 +10587,7 @@
           <w:sz w:val="24"/>
           <w:szCs w:val="24"/>
         </w:rPr>
-        <w:t xml:space="preserve"> creates roles Student/Staff and a staff user (shakkhorpaul50@gmail.com / $h@2kh0R) idempotently.</w:t>
+        <w:t xml:space="preserve"> creates roles Student/Staff and a staff user (shikha@iubat.edu / P@ssW0rd) idempotently.</w:t>
       </w:r>
     </w:p>
     <w:p>
@@ -11641,7 +11706,7 @@
           <w:sz w:val="24"/>
           <w:szCs w:val="24"/>
         </w:rPr>
-        <w:t xml:space="preserve"> + unobtrusive; asp-validation-for spans show inline errors; form-control focus ring teal.</w:t>
+        <w:t xml:space="preserve"> + unobtrusive; asp-validation-for spans show inline errors; form-control focus ring cardinal.</w:t>
       </w:r>
     </w:p>
     <w:p>
@@ -12151,7 +12216,7 @@
           <w:szCs w:val="24"/>
         </w:rPr>
         <w:lastRenderedPageBreak/>
-        <w:t>Logout is POST with anti-forgery; navbar shows badge-student (amber) vs badge-staff (teal).</w:t>
+        <w:t>Logout is POST with anti-forgery; navbar shows badge-student (gray) vs badge-staff (cardinal).</w:t>
       </w:r>
     </w:p>
     <w:p>
@@ -12277,7 +12342,7 @@
           <w:sz w:val="24"/>
           <w:szCs w:val="24"/>
         </w:rPr>
-        <w:t xml:space="preserve"> (WebApplication2) declares </w:t>
+        <w:t xml:space="preserve"> (WebApplication1) declares </w:t>
       </w:r>
       <w:proofErr w:type="spellStart"/>
       <w:r>
@@ -12357,7 +12422,7 @@
           <w:sz w:val="24"/>
           <w:szCs w:val="24"/>
         </w:rPr>
-        <w:t xml:space="preserve">Neon pooler host ep-sweet-night-ay088hki-pooler.c-5... with SSL Require + </w:t>
+        <w:t xml:space="preserve">Neon pooler host ep-snowy-cherry-axbwx1z8-pooler.c-4.us-east-2.aws.neon.tech... with SSL Require + </w:t>
       </w:r>
       <w:proofErr w:type="spellStart"/>
       <w:r>
@@ -12457,7 +12522,7 @@
           <w:sz w:val="24"/>
           <w:szCs w:val="24"/>
         </w:rPr>
-        <w:t>All screenshots below are from WebApplication2 (Emerald Academic) running locally via dotnet run and via Render. Placeholders show layout; replace with actual PNGs per deliverable.</w:t>
+        <w:t>All screenshots below are from WebApplication1 (MIT-inspired) running locally via dotnet run and via Render. Placeholders show layout; replace with actual PNGs per deliverable.</w:t>
       </w:r>
     </w:p>
     <w:tbl>
@@ -13287,7 +13352,7 @@
           <w:sz w:val="24"/>
           <w:szCs w:val="24"/>
         </w:rPr>
-        <w:t>This report documented the design and implementation of WebApplication2 — the IUBAT Campus Services Portal — a focused ASP.NET MVC solution to the manual student-request problem.</w:t>
+        <w:t>This report documented the design and implementation of WebApplication1 — the IUBAT Campus Services Portal — a focused ASP.NET MVC solution to the manual student-request problem.</w:t>
       </w:r>
     </w:p>
     <w:p>
@@ -13599,7 +13664,7 @@
           <w:sz w:val="24"/>
           <w:szCs w:val="24"/>
         </w:rPr>
-        <w:t xml:space="preserve"> + env-var DB injection so the same Docker image runs locally and on Render without leaking secrets; (6) Emerald Academic theme as a view-only fork of WebApplication1 to prove MVC view independence.</w:t>
+        <w:t xml:space="preserve"> + env-var DB injection so the same Docker image runs locally and on Render without leaking secrets; (6) MIT-inspired theme as a view-only fork of WebApplication1 to prove MVC view independence.</w:t>
       </w:r>
     </w:p>
     <w:p>
@@ -13641,7 +13706,7 @@
           <w:sz w:val="24"/>
           <w:szCs w:val="24"/>
         </w:rPr>
-        <w:t xml:space="preserve"> + pooled Neon is sufficient for prototype scale but should migrate to EF Migrations + indexed full-text search for production. The app meets every Part C minimum and is live-ready on Render + Neon (c8e0aa1).</w:t>
+        <w:t xml:space="preserve"> + pooled Neon is sufficient for prototype scale but should migrate to EF Migrations + indexed full-text search for production. The app meets every Part C minimum and is live-ready on Render + Neon (b47cec9).</w:t>
       </w:r>
     </w:p>
     <w:p>
@@ -14291,7 +14356,7 @@
                 <w:color w:val="1C2B28"/>
                 <w:sz w:val="15"/>
               </w:rPr>
-              <w:t>ASP.NET MVC project/source code (WebApplication2)</w:t>
+              <w:t>ASP.NET MVC project/source code (WebApplication1)</w:t>
             </w:r>
           </w:p>
         </w:tc>
@@ -14338,7 +14403,7 @@
                 <w:color w:val="1C2B28"/>
                 <w:sz w:val="15"/>
               </w:rPr>
-              <w:t>github.com/maya1405-maker/</w:t>
+              <w:t>github.com/shikha42/</w:t>
             </w:r>
             <w:proofErr w:type="spellStart"/>
             <w:r>
@@ -14354,7 +14419,7 @@
                 <w:color w:val="1C2B28"/>
                 <w:sz w:val="15"/>
               </w:rPr>
-              <w:t xml:space="preserve"> @ c8e0aa1</w:t>
+              <w:t xml:space="preserve"> @ b47cec9</w:t>
             </w:r>
           </w:p>
         </w:tc>
@@ -14456,7 +14521,7 @@
                 <w:color w:val="1C2B28"/>
                 <w:sz w:val="15"/>
               </w:rPr>
-              <w:t>neondb_backup_WebApplication2.sql</w:t>
+              <w:t>neondb_backup_WebApplication1.sql</w:t>
             </w:r>
           </w:p>
         </w:tc>
@@ -14545,7 +14610,7 @@
                 <w:color w:val="1C2B28"/>
                 <w:sz w:val="15"/>
               </w:rPr>
-              <w:t>WebApplication2/*.docx + KPA.pdf</w:t>
+              <w:t>WebApplication1/*.docx + KPA.pdf</w:t>
             </w:r>
           </w:p>
         </w:tc>
@@ -14658,7 +14723,7 @@
                 <w:color w:val="1C2B28"/>
                 <w:sz w:val="15"/>
               </w:rPr>
-              <w:t>demo_WebApplication2.mp4</w:t>
+              <w:t>demo_WebApplication1.mp4</w:t>
             </w:r>
           </w:p>
         </w:tc>
@@ -14690,7 +14755,7 @@
 </w:document>
 </file>
 
-<file path=word/endnotes.xml><?xml version="1.0" encoding="utf-8"?>
+<file path=word\endnotes.xml><?xml version="1.0" encoding="utf-8"?>
 <w:endnotes xmlns:wpc="http://schemas.microsoft.com/office/word/2010/wordprocessingCanvas" xmlns:cx="http://schemas.microsoft.com/office/drawing/2014/chartex" xmlns:cx1="http://schemas.microsoft.com/office/drawing/2015/9/8/chartex" xmlns:cx2="http://schemas.microsoft.com/office/drawing/2015/10/21/chartex" xmlns:cx3="http://schemas.microsoft.com/office/drawing/2016/5/9/chartex" xmlns:cx4="http://schemas.microsoft.com/office/drawing/2016/5/10/chartex" xmlns:cx5="http://schemas.microsoft.com/office/drawing/2016/5/11/chartex" xmlns:cx6="http://schemas.microsoft.com/office/drawing/2016/5/12/chartex" xmlns:cx7="http://schemas.microsoft.com/office/drawing/2016/5/13/chartex" xmlns:cx8="http://schemas.microsoft.com/office/drawing/2016/5/14/chartex" xmlns:mc="http://schemas.openxmlformats.org/markup-compatibility/2006" xmlns:aink="http://schemas.microsoft.com/office/drawing/2016/ink" xmlns:am3d="http://schemas.microsoft.com/office/drawing/2017/model3d" xmlns:o="urn:schemas-microsoft-com:office:office" xmlns:r="http://schemas.openxmlformats.org/officeDocument/2006/relationships" xmlns:m="http://schemas.openxmlformats.org/officeDocument/2006/math" xmlns:v="urn:schemas-microsoft-com:vml" xmlns:wp14="http://schemas.microsoft.com/office/word/2010/wordprocessingDrawing" xmlns:wp="http://schemas.openxmlformats.org/drawingml/2006/wordprocessingDrawing" xmlns:w10="urn:schemas-microsoft-com:office:word" xmlns:w="http://schemas.openxmlformats.org/wordprocessingml/2006/main" xmlns:w14="http://schemas.microsoft.com/office/word/2010/wordml" xmlns:w15="http://schemas.microsoft.com/office/word/2012/wordml" xmlns:w16cex="http://schemas.microsoft.com/office/word/2018/wordml/cex" xmlns:w16cid="http://schemas.microsoft.com/office/word/2016/wordml/cid" xmlns:w16="http://schemas.microsoft.com/office/word/2018/wordml" xmlns:w16sdtdh="http://schemas.microsoft.com/office/word/2020/wordml/sdtdatahash" xmlns:w16se="http://schemas.microsoft.com/office/word/2015/wordml/symex" xmlns:wpg="http://schemas.microsoft.com/office/word/2010/wordprocessingGroup" xmlns:wpi="http://schemas.microsoft.com/office/word/2010/wordprocessingInk" xmlns:wne="http://schemas.microsoft.com/office/word/2006/wordml" xmlns:wps="http://schemas.microsoft.com/office/word/2010/wordprocessingShape" mc:Ignorable="w14 w15 w16se w16cid w16 w16cex w16sdtdh wp14">
   <w:endnote w:type="separator" w:id="-1">
     <w:p>
@@ -14715,7 +14780,84 @@
 </w:endnotes>
 </file>
 
-<file path=word/footer1.xml><?xml version="1.0" encoding="utf-8"?>
+<file path=word\fontTable.xml><?xml version="1.0" encoding="utf-8"?>
+<w:fonts xmlns:mc="http://schemas.openxmlformats.org/markup-compatibility/2006" xmlns:r="http://schemas.openxmlformats.org/officeDocument/2006/relationships" xmlns:w="http://schemas.openxmlformats.org/wordprocessingml/2006/main" xmlns:w14="http://schemas.microsoft.com/office/word/2010/wordml" xmlns:w15="http://schemas.microsoft.com/office/word/2012/wordml" xmlns:w16cex="http://schemas.microsoft.com/office/word/2018/wordml/cex" xmlns:w16cid="http://schemas.microsoft.com/office/word/2016/wordml/cid" xmlns:w16="http://schemas.microsoft.com/office/word/2018/wordml" xmlns:w16sdtdh="http://schemas.microsoft.com/office/word/2020/wordml/sdtdatahash" xmlns:w16se="http://schemas.microsoft.com/office/word/2015/wordml/symex" mc:Ignorable="w14 w15 w16se w16cid w16 w16cex w16sdtdh">
+  <w:font w:name="Symbol">
+    <w:panose1 w:val="05050102010706020507"/>
+    <w:charset w:val="02"/>
+    <w:family w:val="roman"/>
+    <w:pitch w:val="variable"/>
+    <w:sig w:usb0="00000000" w:usb1="10000000" w:usb2="00000000" w:usb3="00000000" w:csb0="80000000" w:csb1="00000000"/>
+  </w:font>
+  <w:font w:name="Times New Roman">
+    <w:panose1 w:val="02020603050405020304"/>
+    <w:charset w:val="00"/>
+    <w:family w:val="roman"/>
+    <w:pitch w:val="variable"/>
+    <w:sig w:usb0="E0002EFF" w:usb1="C000785B" w:usb2="00000009" w:usb3="00000000" w:csb0="000001FF" w:csb1="00000000"/>
+  </w:font>
+  <w:font w:name="Cambria">
+    <w:panose1 w:val="02040503050406030204"/>
+    <w:charset w:val="00"/>
+    <w:family w:val="roman"/>
+    <w:pitch w:val="variable"/>
+    <w:sig w:usb0="E00006FF" w:usb1="420024FF" w:usb2="02000000" w:usb3="00000000" w:csb0="0000019F" w:csb1="00000000"/>
+  </w:font>
+  <w:font w:name="MS Mincho">
+    <w:altName w:val="ＭＳ 明朝"/>
+    <w:panose1 w:val="02020609040205080304"/>
+    <w:charset w:val="80"/>
+    <w:family w:val="roman"/>
+    <w:pitch w:val="fixed"/>
+    <w:sig w:usb0="00000001" w:usb1="08070000" w:usb2="00000010" w:usb3="00000000" w:csb0="00020000" w:csb1="00000000"/>
+  </w:font>
+  <w:font w:name="Vrinda">
+    <w:panose1 w:val="020B0502040204020203"/>
+    <w:charset w:val="00"/>
+    <w:family w:val="swiss"/>
+    <w:pitch w:val="variable"/>
+    <w:sig w:usb0="00010003" w:usb1="00000000" w:usb2="00000000" w:usb3="00000000" w:csb0="00000001" w:csb1="00000000"/>
+  </w:font>
+  <w:font w:name="Calibri">
+    <w:panose1 w:val="020F0502020204030204"/>
+    <w:charset w:val="00"/>
+    <w:family w:val="swiss"/>
+    <w:pitch w:val="variable"/>
+    <w:sig w:usb0="E4002EFF" w:usb1="C200247B" w:usb2="00000009" w:usb3="00000000" w:csb0="000001FF" w:csb1="00000000"/>
+  </w:font>
+  <w:font w:name="MS Gothic">
+    <w:altName w:val="ＭＳ ゴシック"/>
+    <w:panose1 w:val="020B0609070205080204"/>
+    <w:charset w:val="80"/>
+    <w:family w:val="modern"/>
+    <w:pitch w:val="fixed"/>
+    <w:sig w:usb0="E00002FF" w:usb1="6AC7FDFB" w:usb2="08000012" w:usb3="00000000" w:csb0="0002009F" w:csb1="00000000"/>
+  </w:font>
+  <w:font w:name="Courier">
+    <w:panose1 w:val="02070409020205020404"/>
+    <w:charset w:val="00"/>
+    <w:family w:val="auto"/>
+    <w:pitch w:val="variable"/>
+    <w:sig w:usb0="00000003" w:usb1="00000000" w:usb2="00000000" w:usb3="00000000" w:csb0="00000001" w:csb1="00000000"/>
+  </w:font>
+  <w:font w:name="Consolas">
+    <w:panose1 w:val="020B0609020204030204"/>
+    <w:charset w:val="00"/>
+    <w:family w:val="modern"/>
+    <w:pitch w:val="fixed"/>
+    <w:sig w:usb0="E00006FF" w:usb1="0000FCFF" w:usb2="00000001" w:usb3="00000000" w:csb0="0000019F" w:csb1="00000000"/>
+  </w:font>
+  <w:font w:name="Segoe UI Symbol">
+    <w:panose1 w:val="020B0502040204020203"/>
+    <w:charset w:val="00"/>
+    <w:family w:val="swiss"/>
+    <w:pitch w:val="variable"/>
+    <w:sig w:usb0="800001E3" w:usb1="1200FFEF" w:usb2="00040000" w:usb3="00000000" w:csb0="00000001" w:csb1="00000000"/>
+  </w:font>
+</w:fonts>
+</file>
+
+<file path=word\footer1.xml><?xml version="1.0" encoding="utf-8"?>
 <w:ftr xmlns:wpc="http://schemas.microsoft.com/office/word/2010/wordprocessingCanvas" xmlns:cx="http://schemas.microsoft.com/office/drawing/2014/chartex" xmlns:cx1="http://schemas.microsoft.com/office/drawing/2015/9/8/chartex" xmlns:cx2="http://schemas.microsoft.com/office/drawing/2015/10/21/chartex" xmlns:cx3="http://schemas.microsoft.com/office/drawing/2016/5/9/chartex" xmlns:cx4="http://schemas.microsoft.com/office/drawing/2016/5/10/chartex" xmlns:cx5="http://schemas.microsoft.com/office/drawing/2016/5/11/chartex" xmlns:cx6="http://schemas.microsoft.com/office/drawing/2016/5/12/chartex" xmlns:cx7="http://schemas.microsoft.com/office/drawing/2016/5/13/chartex" xmlns:cx8="http://schemas.microsoft.com/office/drawing/2016/5/14/chartex" xmlns:mc="http://schemas.openxmlformats.org/markup-compatibility/2006" xmlns:aink="http://schemas.microsoft.com/office/drawing/2016/ink" xmlns:am3d="http://schemas.microsoft.com/office/drawing/2017/model3d" xmlns:o="urn:schemas-microsoft-com:office:office" xmlns:r="http://schemas.openxmlformats.org/officeDocument/2006/relationships" xmlns:m="http://schemas.openxmlformats.org/officeDocument/2006/math" xmlns:v="urn:schemas-microsoft-com:vml" xmlns:wp14="http://schemas.microsoft.com/office/word/2010/wordprocessingDrawing" xmlns:wp="http://schemas.openxmlformats.org/drawingml/2006/wordprocessingDrawing" xmlns:w10="urn:schemas-microsoft-com:office:word" xmlns:w="http://schemas.openxmlformats.org/wordprocessingml/2006/main" xmlns:w14="http://schemas.microsoft.com/office/word/2010/wordml" xmlns:w15="http://schemas.microsoft.com/office/word/2012/wordml" xmlns:w16cex="http://schemas.microsoft.com/office/word/2018/wordml/cex" xmlns:w16cid="http://schemas.microsoft.com/office/word/2016/wordml/cid" xmlns:w16="http://schemas.microsoft.com/office/word/2018/wordml" xmlns:w16sdtdh="http://schemas.microsoft.com/office/word/2020/wordml/sdtdatahash" xmlns:w16se="http://schemas.microsoft.com/office/word/2015/wordml/symex" xmlns:wpg="http://schemas.microsoft.com/office/word/2010/wordprocessingGroup" xmlns:wpi="http://schemas.microsoft.com/office/word/2010/wordprocessingInk" xmlns:wne="http://schemas.microsoft.com/office/word/2006/wordml" xmlns:wps="http://schemas.microsoft.com/office/word/2010/wordprocessingShape" mc:Ignorable="w14 w15 w16se w16cid w16 w16cex w16sdtdh wp14">
   <w:p>
     <w:pPr>
@@ -14788,7 +14930,7 @@
 </w:ftr>
 </file>
 
-<file path=word/footnotes.xml><?xml version="1.0" encoding="utf-8"?>
+<file path=word\footnotes.xml><?xml version="1.0" encoding="utf-8"?>
 <w:footnotes xmlns:wpc="http://schemas.microsoft.com/office/word/2010/wordprocessingCanvas" xmlns:cx="http://schemas.microsoft.com/office/drawing/2014/chartex" xmlns:cx1="http://schemas.microsoft.com/office/drawing/2015/9/8/chartex" xmlns:cx2="http://schemas.microsoft.com/office/drawing/2015/10/21/chartex" xmlns:cx3="http://schemas.microsoft.com/office/drawing/2016/5/9/chartex" xmlns:cx4="http://schemas.microsoft.com/office/drawing/2016/5/10/chartex" xmlns:cx5="http://schemas.microsoft.com/office/drawing/2016/5/11/chartex" xmlns:cx6="http://schemas.microsoft.com/office/drawing/2016/5/12/chartex" xmlns:cx7="http://schemas.microsoft.com/office/drawing/2016/5/13/chartex" xmlns:cx8="http://schemas.microsoft.com/office/drawing/2016/5/14/chartex" xmlns:mc="http://schemas.openxmlformats.org/markup-compatibility/2006" xmlns:aink="http://schemas.microsoft.com/office/drawing/2016/ink" xmlns:am3d="http://schemas.microsoft.com/office/drawing/2017/model3d" xmlns:o="urn:schemas-microsoft-com:office:office" xmlns:r="http://schemas.openxmlformats.org/officeDocument/2006/relationships" xmlns:m="http://schemas.openxmlformats.org/officeDocument/2006/math" xmlns:v="urn:schemas-microsoft-com:vml" xmlns:wp14="http://schemas.microsoft.com/office/word/2010/wordprocessingDrawing" xmlns:wp="http://schemas.openxmlformats.org/drawingml/2006/wordprocessingDrawing" xmlns:w10="urn:schemas-microsoft-com:office:word" xmlns:w="http://schemas.openxmlformats.org/wordprocessingml/2006/main" xmlns:w14="http://schemas.microsoft.com/office/word/2010/wordml" xmlns:w15="http://schemas.microsoft.com/office/word/2012/wordml" xmlns:w16cex="http://schemas.microsoft.com/office/word/2018/wordml/cex" xmlns:w16cid="http://schemas.microsoft.com/office/word/2016/wordml/cid" xmlns:w16="http://schemas.microsoft.com/office/word/2018/wordml" xmlns:w16sdtdh="http://schemas.microsoft.com/office/word/2020/wordml/sdtdatahash" xmlns:w16se="http://schemas.microsoft.com/office/word/2015/wordml/symex" xmlns:wpg="http://schemas.microsoft.com/office/word/2010/wordprocessingGroup" xmlns:wpi="http://schemas.microsoft.com/office/word/2010/wordprocessingInk" xmlns:wne="http://schemas.microsoft.com/office/word/2006/wordml" xmlns:wps="http://schemas.microsoft.com/office/word/2010/wordprocessingShape" mc:Ignorable="w14 w15 w16se w16cid w16 w16cex w16sdtdh wp14">
   <w:footnote w:type="separator" w:id="-1">
     <w:p>
@@ -14813,7 +14955,7 @@
 </w:footnotes>
 </file>
 
-<file path=word/numbering.xml><?xml version="1.0" encoding="utf-8"?>
+<file path=word\numbering.xml><?xml version="1.0" encoding="utf-8"?>
 <w:numbering xmlns:wpc="http://schemas.microsoft.com/office/word/2010/wordprocessingCanvas" xmlns:cx="http://schemas.microsoft.com/office/drawing/2014/chartex" xmlns:cx1="http://schemas.microsoft.com/office/drawing/2015/9/8/chartex" xmlns:cx2="http://schemas.microsoft.com/office/drawing/2015/10/21/chartex" xmlns:cx3="http://schemas.microsoft.com/office/drawing/2016/5/9/chartex" xmlns:cx4="http://schemas.microsoft.com/office/drawing/2016/5/10/chartex" xmlns:cx5="http://schemas.microsoft.com/office/drawing/2016/5/11/chartex" xmlns:cx6="http://schemas.microsoft.com/office/drawing/2016/5/12/chartex" xmlns:cx7="http://schemas.microsoft.com/office/drawing/2016/5/13/chartex" xmlns:cx8="http://schemas.microsoft.com/office/drawing/2016/5/14/chartex" xmlns:mc="http://schemas.openxmlformats.org/markup-compatibility/2006" xmlns:aink="http://schemas.microsoft.com/office/drawing/2016/ink" xmlns:am3d="http://schemas.microsoft.com/office/drawing/2017/model3d" xmlns:o="urn:schemas-microsoft-com:office:office" xmlns:r="http://schemas.openxmlformats.org/officeDocument/2006/relationships" xmlns:m="http://schemas.openxmlformats.org/officeDocument/2006/math" xmlns:v="urn:schemas-microsoft-com:vml" xmlns:wp14="http://schemas.microsoft.com/office/word/2010/wordprocessingDrawing" xmlns:wp="http://schemas.openxmlformats.org/drawingml/2006/wordprocessingDrawing" xmlns:w10="urn:schemas-microsoft-com:office:word" xmlns:w="http://schemas.openxmlformats.org/wordprocessingml/2006/main" xmlns:w14="http://schemas.microsoft.com/office/word/2010/wordml" xmlns:w15="http://schemas.microsoft.com/office/word/2012/wordml" xmlns:w16cex="http://schemas.microsoft.com/office/word/2018/wordml/cex" xmlns:w16cid="http://schemas.microsoft.com/office/word/2016/wordml/cid" xmlns:w16="http://schemas.microsoft.com/office/word/2018/wordml" xmlns:w16sdtdh="http://schemas.microsoft.com/office/word/2020/wordml/sdtdatahash" xmlns:w16se="http://schemas.microsoft.com/office/word/2015/wordml/symex" xmlns:wpg="http://schemas.microsoft.com/office/word/2010/wordprocessingGroup" xmlns:wpi="http://schemas.microsoft.com/office/word/2010/wordprocessingInk" xmlns:wne="http://schemas.microsoft.com/office/word/2006/wordml" xmlns:wps="http://schemas.microsoft.com/office/word/2010/wordprocessingShape" mc:Ignorable="w14 w15 w16se w16cid w16 w16cex w16sdtdh wp14">
   <w:abstractNum w:abstractNumId="0" w15:restartNumberingAfterBreak="0">
     <w:nsid w:val="FFFFFF7C"/>
@@ -15016,7 +15158,103 @@
 </w:numbering>
 </file>
 
-<file path=word/styles.xml><?xml version="1.0" encoding="utf-8"?>
+<file path=word\settings.xml><?xml version="1.0" encoding="utf-8"?>
+<w:settings xmlns:mc="http://schemas.openxmlformats.org/markup-compatibility/2006" xmlns:o="urn:schemas-microsoft-com:office:office" xmlns:r="http://schemas.openxmlformats.org/officeDocument/2006/relationships" xmlns:m="http://schemas.openxmlformats.org/officeDocument/2006/math" xmlns:v="urn:schemas-microsoft-com:vml" xmlns:w10="urn:schemas-microsoft-com:office:word" xmlns:w="http://schemas.openxmlformats.org/wordprocessingml/2006/main" xmlns:w14="http://schemas.microsoft.com/office/word/2010/wordml" xmlns:w15="http://schemas.microsoft.com/office/word/2012/wordml" xmlns:w16cex="http://schemas.microsoft.com/office/word/2018/wordml/cex" xmlns:w16cid="http://schemas.microsoft.com/office/word/2016/wordml/cid" xmlns:w16="http://schemas.microsoft.com/office/word/2018/wordml" xmlns:w16sdtdh="http://schemas.microsoft.com/office/word/2020/wordml/sdtdatahash" xmlns:w16se="http://schemas.microsoft.com/office/word/2015/wordml/symex" xmlns:sl="http://schemas.openxmlformats.org/schemaLibrary/2006/main" mc:Ignorable="w14 w15 w16se w16cid w16 w16cex w16sdtdh">
+  <w:zoom w:percent="126"/>
+  <w:proofState w:spelling="clean" w:grammar="clean"/>
+  <w:defaultTabStop w:val="720"/>
+  <w:characterSpacingControl w:val="doNotCompress"/>
+  <w:footnotePr>
+    <w:footnote w:id="-1"/>
+    <w:footnote w:id="0"/>
+  </w:footnotePr>
+  <w:endnotePr>
+    <w:endnote w:id="-1"/>
+    <w:endnote w:id="0"/>
+  </w:endnotePr>
+  <w:compat>
+    <w:useFELayout/>
+    <w:compatSetting w:name="compatibilityMode" w:uri="http://schemas.microsoft.com/office/word" w:val="14"/>
+    <w:compatSetting w:name="overrideTableStyleFontSizeAndJustification" w:uri="http://schemas.microsoft.com/office/word" w:val="1"/>
+    <w:compatSetting w:name="enableOpenTypeFeatures" w:uri="http://schemas.microsoft.com/office/word" w:val="1"/>
+    <w:compatSetting w:name="doNotFlipMirrorIndents" w:uri="http://schemas.microsoft.com/office/word" w:val="1"/>
+    <w:compatSetting w:name="useWord2013TrackBottomHyphenation" w:uri="http://schemas.microsoft.com/office/word" w:val="1"/>
+  </w:compat>
+  <w:rsids>
+    <w:rsidRoot w:val="00B47730"/>
+    <w:rsid w:val="00034616"/>
+    <w:rsid w:val="0006063C"/>
+    <w:rsid w:val="0015074B"/>
+    <w:rsid w:val="001F7214"/>
+    <w:rsid w:val="0028623C"/>
+    <w:rsid w:val="0029639D"/>
+    <w:rsid w:val="002C5472"/>
+    <w:rsid w:val="002C7E18"/>
+    <w:rsid w:val="00303297"/>
+    <w:rsid w:val="00326F90"/>
+    <w:rsid w:val="00351490"/>
+    <w:rsid w:val="003D7D24"/>
+    <w:rsid w:val="003F4888"/>
+    <w:rsid w:val="00425F10"/>
+    <w:rsid w:val="00480B95"/>
+    <w:rsid w:val="004E106F"/>
+    <w:rsid w:val="005177FE"/>
+    <w:rsid w:val="006125FD"/>
+    <w:rsid w:val="007057D6"/>
+    <w:rsid w:val="00865D3D"/>
+    <w:rsid w:val="008F12EE"/>
+    <w:rsid w:val="0093401F"/>
+    <w:rsid w:val="00976991"/>
+    <w:rsid w:val="009B75B8"/>
+    <w:rsid w:val="009D2771"/>
+    <w:rsid w:val="00A73B0F"/>
+    <w:rsid w:val="00AA1D8D"/>
+    <w:rsid w:val="00AB3677"/>
+    <w:rsid w:val="00B47730"/>
+    <w:rsid w:val="00B9138E"/>
+    <w:rsid w:val="00B93FED"/>
+    <w:rsid w:val="00CB0664"/>
+    <w:rsid w:val="00CE2AE7"/>
+    <w:rsid w:val="00D24C82"/>
+    <w:rsid w:val="00D42A36"/>
+    <w:rsid w:val="00E1342F"/>
+    <w:rsid w:val="00E414C0"/>
+    <w:rsid w:val="00F17A62"/>
+    <w:rsid w:val="00F63C6D"/>
+    <w:rsid w:val="00F84AEB"/>
+    <w:rsid w:val="00FC693F"/>
+  </w:rsids>
+  <m:mathPr>
+    <m:mathFont m:val="Cambria Math"/>
+    <m:brkBin m:val="before"/>
+    <m:brkBinSub m:val="--"/>
+    <m:smallFrac m:val="0"/>
+    <m:dispDef/>
+    <m:lMargin m:val="0"/>
+    <m:rMargin m:val="0"/>
+    <m:defJc m:val="centerGroup"/>
+    <m:wrapIndent m:val="1440"/>
+    <m:intLim m:val="subSup"/>
+    <m:naryLim m:val="undOvr"/>
+  </m:mathPr>
+  <w:themeFontLang w:val="en-US" w:eastAsia="ja-JP" w:bidi="bn-BD"/>
+  <w:clrSchemeMapping w:bg1="light1" w:t1="dark1" w:bg2="light2" w:t2="dark2" w:accent1="accent1" w:accent2="accent2" w:accent3="accent3" w:accent4="accent4" w:accent5="accent5" w:accent6="accent6" w:hyperlink="hyperlink" w:followedHyperlink="followedHyperlink"/>
+  <w:doNotAutoCompressPictures/>
+  <w:shapeDefaults>
+    <o:shapedefaults v:ext="edit" spidmax="1026"/>
+    <o:shapelayout v:ext="edit">
+      <o:idmap v:ext="edit" data="1"/>
+    </o:shapelayout>
+  </w:shapeDefaults>
+  <w:decimalSymbol w:val="."/>
+  <w:listSeparator w:val=","/>
+  <w14:docId w14:val="4EAB9E55"/>
+  <w14:defaultImageDpi w14:val="300"/>
+  <w15:docId w15:val="{370BD7ED-832C-4782-AC41-1BC4979A81A4}"/>
+</w:settings>
+</file>
+
+<file path=word\styles.xml><?xml version="1.0" encoding="utf-8"?>
 <w:styles xmlns:mc="http://schemas.openxmlformats.org/markup-compatibility/2006" xmlns:r="http://schemas.openxmlformats.org/officeDocument/2006/relationships" xmlns:w="http://schemas.openxmlformats.org/wordprocessingml/2006/main" xmlns:w14="http://schemas.microsoft.com/office/word/2010/wordml" xmlns:w15="http://schemas.microsoft.com/office/word/2012/wordml" xmlns:w16cex="http://schemas.microsoft.com/office/word/2018/wordml/cex" xmlns:w16cid="http://schemas.microsoft.com/office/word/2016/wordml/cid" xmlns:w16="http://schemas.microsoft.com/office/word/2018/wordml" xmlns:w16sdtdh="http://schemas.microsoft.com/office/word/2020/wordml/sdtdatahash" xmlns:w16se="http://schemas.microsoft.com/office/word/2015/wordml/symex" mc:Ignorable="w14 w15 w16se w16cid w16 w16cex w16sdtdh">
   <w:docDefaults>
     <w:rPrDefault>
@@ -27089,7 +27327,7 @@
 </w:styles>
 </file>
 
-<file path=word/theme/theme1.xml><?xml version="1.0" encoding="utf-8"?>
+<file path=word\theme\theme1.xml><?xml version="1.0" encoding="utf-8"?>
 <a:theme xmlns:a="http://schemas.openxmlformats.org/drawingml/2006/main" name="Office Theme">
   <a:themeElements>
     <a:clrScheme name="Office">
@@ -27409,14 +27647,8 @@
 </a:theme>
 </file>
 
-<file path=customXml/item1.xml><?xml version="1.0" encoding="utf-8"?>
-<b:Sources xmlns:b="http://schemas.openxmlformats.org/officeDocument/2006/bibliography" xmlns="http://schemas.openxmlformats.org/officeDocument/2006/bibliography" SelectedStyle="/APA.XSL" StyleName="APA"/>
-</file>
-
-<file path=customXml/itemProps1.xml><?xml version="1.0" encoding="utf-8"?>
-<ds:datastoreItem xmlns:ds="http://schemas.openxmlformats.org/officeDocument/2006/customXml" ds:itemID="{EF278816-EC6F-A645-907D-7F25AECB1D4A}">
-  <ds:schemaRefs>
-    <ds:schemaRef ds:uri="http://schemas.openxmlformats.org/officeDocument/2006/bibliography"/>
-  </ds:schemaRefs>
-</ds:datastoreItem>
+<file path=word\webSettings.xml><?xml version="1.0" encoding="utf-8"?>
+<w:webSettings xmlns:mc="http://schemas.openxmlformats.org/markup-compatibility/2006" xmlns:r="http://schemas.openxmlformats.org/officeDocument/2006/relationships" xmlns:w="http://schemas.openxmlformats.org/wordprocessingml/2006/main" xmlns:w14="http://schemas.microsoft.com/office/word/2010/wordml" xmlns:w15="http://schemas.microsoft.com/office/word/2012/wordml" xmlns:w16cex="http://schemas.microsoft.com/office/word/2018/wordml/cex" xmlns:w16cid="http://schemas.microsoft.com/office/word/2016/wordml/cid" xmlns:w16="http://schemas.microsoft.com/office/word/2018/wordml" xmlns:w16sdtdh="http://schemas.microsoft.com/office/word/2020/wordml/sdtdatahash" xmlns:w16se="http://schemas.microsoft.com/office/word/2015/wordml/symex" mc:Ignorable="w14 w15 w16se w16cid w16 w16cex w16sdtdh">
+  <w:allowPNG/>
+</w:webSettings>
 </file>
</xml_diff>